<commit_message>
Actualizacion de template e inclusion de frases para CNVs positivos en resultado e interpretacion
</commit_message>
<xml_diff>
--- a/templates/positivo_cnv.docx
+++ b/templates/positivo_cnv.docx
@@ -693,9 +693,6 @@
       <w:pPr>
         <w:spacing w:before="120" w:after="240"/>
         <w:jc w:val="both"/>
-        <w:rPr>
-          <w:b/>
-        </w:rPr>
       </w:pPr>
       <w:r>
         <w:rPr>
@@ -772,32 +769,11 @@
       </w:r>
       <w:r>
         <w:rPr>
-          <w:b/>
-          <w:bCs/>
           <w:sz w:val="22"/>
           <w:szCs w:val="22"/>
           <w:highlight w:val="yellow"/>
         </w:rPr>
-        <w:t>No s</w:t>
-      </w:r>
-      <w:r>
-        <w:rPr>
-          <w:b/>
-          <w:bCs/>
-          <w:sz w:val="22"/>
-          <w:szCs w:val="22"/>
-          <w:highlight w:val="yellow"/>
-        </w:rPr>
-        <w:t>e</w:t>
-      </w:r>
-      <w:r>
-        <w:rPr>
-          <w:b/>
-          <w:bCs/>
-          <w:sz w:val="22"/>
-          <w:szCs w:val="22"/>
-        </w:rPr>
-        <w:t xml:space="preserve"> hallaron Variantes Patogénicas.</w:t>
+        <w:t>{{ RESULTADO_VARIANTES_PATOGENICAS }}</w:t>
       </w:r>
     </w:p>
     <w:p>
@@ -806,8 +782,15 @@
         <w:jc w:val="both"/>
         <w:rPr>
           <w:b/>
-        </w:rPr>
-      </w:pPr>
+          <w:u w:val="single"/>
+        </w:rPr>
+      </w:pPr>
+      <w:r>
+        <w:rPr>
+          <w:b/>
+        </w:rPr>
+        <w:t>{{ CNV_TABLE }}</w:t>
+      </w:r>
     </w:p>
     <w:p>
       <w:pPr>
@@ -815,15 +798,8 @@
         <w:jc w:val="both"/>
         <w:rPr>
           <w:b/>
-          <w:u w:val="single"/>
-        </w:rPr>
-      </w:pPr>
-      <w:r>
-        <w:rPr>
-          <w:b/>
-        </w:rPr>
-        <w:t>{{ CNV_TABLE }}</w:t>
-      </w:r>
+        </w:rPr>
+      </w:pPr>
     </w:p>
     <w:p>
       <w:pPr>
@@ -851,15 +827,6 @@
           <w:b/>
         </w:rPr>
       </w:pPr>
-    </w:p>
-    <w:p>
-      <w:pPr>
-        <w:spacing w:before="240"/>
-        <w:jc w:val="both"/>
-        <w:rPr>
-          <w:b/>
-        </w:rPr>
-      </w:pPr>
       <w:r>
         <w:rPr>
           <w:b/>
@@ -875,6 +842,7 @@
           <w:bCs/>
           <w:sz w:val="22"/>
           <w:szCs w:val="22"/>
+          <w:u w:val="single"/>
         </w:rPr>
       </w:pPr>
       <w:r>
@@ -883,48 +851,7 @@
           <w:sz w:val="22"/>
           <w:szCs w:val="22"/>
         </w:rPr>
-        <w:t xml:space="preserve">Se </w:t>
-      </w:r>
-      <w:r>
-        <w:rPr>
-          <w:bCs/>
-          <w:sz w:val="22"/>
-          <w:szCs w:val="22"/>
-          <w:highlight w:val="yellow"/>
-        </w:rPr>
-        <w:t>detectó una</w:t>
-      </w:r>
-      <w:r>
-        <w:rPr>
-          <w:bCs/>
-          <w:sz w:val="22"/>
-          <w:szCs w:val="22"/>
-        </w:rPr>
-        <w:t xml:space="preserve"> </w:t>
-      </w:r>
-      <w:r>
-        <w:rPr>
-          <w:bCs/>
-          <w:sz w:val="22"/>
-          <w:szCs w:val="22"/>
-        </w:rPr>
-        <w:t>variante</w:t>
-      </w:r>
-      <w:r>
-        <w:rPr>
-          <w:bCs/>
-          <w:sz w:val="22"/>
-          <w:szCs w:val="22"/>
-        </w:rPr>
-        <w:t xml:space="preserve"> </w:t>
-      </w:r>
-      <w:r>
-        <w:rPr>
-          <w:bCs/>
-          <w:sz w:val="22"/>
-          <w:szCs w:val="22"/>
-        </w:rPr>
-        <w:t xml:space="preserve">en el número de copias (CNV): </w:t>
+        <w:t>{{ CNV_DETECCION_PHRASE }}</w:t>
       </w:r>
     </w:p>
     <w:p>
@@ -1045,7 +972,6 @@
           <w:szCs w:val="22"/>
           <w:highlight w:val="yellow"/>
         </w:rPr>
-        <w:lastRenderedPageBreak/>
         <w:t>Es poco probable que esta duplicación esté asociada con el fenotipo</w:t>
       </w:r>
       <w:r>
@@ -1089,6 +1015,7 @@
           <w:sz w:val="22"/>
           <w:szCs w:val="22"/>
         </w:rPr>
+        <w:lastRenderedPageBreak/>
         <w:t>Ver informe original para más información.</w:t>
       </w:r>
     </w:p>

</xml_diff>

<commit_message>
Agregado de deleciones/duplicaciones, falta interpretacion
</commit_message>
<xml_diff>
--- a/templates/positivo_cnv.docx
+++ b/templates/positivo_cnv.docx
@@ -809,24 +809,6 @@
           <w:b/>
         </w:rPr>
       </w:pPr>
-    </w:p>
-    <w:p>
-      <w:pPr>
-        <w:spacing w:before="240"/>
-        <w:jc w:val="both"/>
-        <w:rPr>
-          <w:b/>
-        </w:rPr>
-      </w:pPr>
-    </w:p>
-    <w:p>
-      <w:pPr>
-        <w:spacing w:before="240"/>
-        <w:jc w:val="both"/>
-        <w:rPr>
-          <w:b/>
-        </w:rPr>
-      </w:pPr>
       <w:r>
         <w:rPr>
           <w:b/>
@@ -842,7 +824,7 @@
           <w:bCs/>
           <w:sz w:val="22"/>
           <w:szCs w:val="22"/>
-          <w:u w:val="single"/>
+          <w:lang w:val="es-AR"/>
         </w:rPr>
       </w:pPr>
       <w:r>
@@ -850,6 +832,7 @@
           <w:bCs/>
           <w:sz w:val="22"/>
           <w:szCs w:val="22"/>
+          <w:lang w:val="es-AR"/>
         </w:rPr>
         <w:t>{{ CNV_DETECCION_PHRASE }}</w:t>
       </w:r>
@@ -859,100 +842,40 @@
         <w:pStyle w:val="Prrafodelista"/>
         <w:numPr>
           <w:ilvl w:val="0"/>
-          <w:numId w:val="4"/>
+          <w:numId w:val="5"/>
         </w:numPr>
         <w:spacing w:before="240" w:after="120"/>
         <w:jc w:val="both"/>
         <w:rPr>
+          <w:b/>
+        </w:rPr>
+      </w:pPr>
+      <w:r>
+        <w:rPr>
           <w:bCs/>
           <w:sz w:val="22"/>
           <w:szCs w:val="22"/>
-        </w:rPr>
-      </w:pPr>
+          <w:u w:val="single"/>
+        </w:rPr>
+        <w:t xml:space="preserve">{% for v in VARIANTS_FOUND %}{{ v.prefix }} </w:t>
+      </w:r>
+      <w:r>
+        <w:rPr>
+          <w:b/>
+          <w:sz w:val="22"/>
+          <w:szCs w:val="22"/>
+          <w:u w:val="single"/>
+        </w:rPr>
+        <w:t>{{ v.suffix_bold }}</w:t>
+      </w:r>
       <w:r>
         <w:rPr>
           <w:bCs/>
           <w:sz w:val="22"/>
           <w:szCs w:val="22"/>
-        </w:rPr>
-        <w:t xml:space="preserve">la </w:t>
-      </w:r>
-      <w:r>
-        <w:rPr>
-          <w:bCs/>
-          <w:sz w:val="22"/>
-          <w:szCs w:val="22"/>
-          <w:highlight w:val="yellow"/>
-        </w:rPr>
-        <w:t>d</w:t>
-      </w:r>
-      <w:r>
-        <w:rPr>
-          <w:bCs/>
-          <w:sz w:val="22"/>
-          <w:szCs w:val="22"/>
-          <w:highlight w:val="yellow"/>
-        </w:rPr>
-        <w:t>uplicación (x 3</w:t>
-      </w:r>
-      <w:r>
-        <w:rPr>
-          <w:bCs/>
-          <w:sz w:val="22"/>
-          <w:szCs w:val="22"/>
-          <w:highlight w:val="yellow"/>
-        </w:rPr>
-        <w:t>)</w:t>
-      </w:r>
-      <w:r>
-        <w:rPr>
-          <w:bCs/>
-          <w:sz w:val="22"/>
-          <w:szCs w:val="22"/>
-        </w:rPr>
-        <w:t xml:space="preserve"> de </w:t>
-      </w:r>
-      <w:r>
-        <w:rPr>
-          <w:bCs/>
-          <w:sz w:val="22"/>
-          <w:szCs w:val="22"/>
-          <w:highlight w:val="yellow"/>
-        </w:rPr>
-        <w:t>1.05 MB (chr6:61,891,638-62,948,594)</w:t>
-      </w:r>
-      <w:r>
-        <w:rPr>
-          <w:bCs/>
-          <w:sz w:val="22"/>
-          <w:szCs w:val="22"/>
-        </w:rPr>
-        <w:t xml:space="preserve"> </w:t>
-      </w:r>
-      <w:r>
-        <w:rPr>
-          <w:bCs/>
-          <w:sz w:val="22"/>
-          <w:szCs w:val="22"/>
-        </w:rPr>
-        <w:t xml:space="preserve">en la región </w:t>
-      </w:r>
-      <w:r>
-        <w:rPr>
-          <w:bCs/>
-          <w:sz w:val="22"/>
-          <w:szCs w:val="22"/>
-          <w:highlight w:val="yellow"/>
-        </w:rPr>
-        <w:t>6q11.1</w:t>
-      </w:r>
-      <w:r>
-        <w:rPr>
-          <w:bCs/>
-          <w:sz w:val="22"/>
-          <w:szCs w:val="22"/>
-        </w:rPr>
-        <w:t xml:space="preserve">. </w:t>
+          <w:u w:val="single"/>
+        </w:rPr>
+        <w:t xml:space="preserve"> {% endfor %}</w:t>
       </w:r>
     </w:p>
     <w:p>
@@ -960,62 +883,15 @@
         <w:spacing w:before="240" w:after="120"/>
         <w:jc w:val="both"/>
         <w:rPr>
+          <w:b/>
+        </w:rPr>
+      </w:pPr>
+      <w:r>
+        <w:rPr>
           <w:bCs/>
           <w:sz w:val="22"/>
           <w:szCs w:val="22"/>
         </w:rPr>
-      </w:pPr>
-      <w:r>
-        <w:rPr>
-          <w:bCs/>
-          <w:sz w:val="22"/>
-          <w:szCs w:val="22"/>
-          <w:highlight w:val="yellow"/>
-        </w:rPr>
-        <w:t>Es poco probable que esta duplicación esté asociada con el fenotipo</w:t>
-      </w:r>
-      <w:r>
-        <w:rPr>
-          <w:bCs/>
-          <w:sz w:val="22"/>
-          <w:szCs w:val="22"/>
-          <w:highlight w:val="yellow"/>
-        </w:rPr>
-        <w:t xml:space="preserve"> del paciente</w:t>
-      </w:r>
-      <w:r>
-        <w:rPr>
-          <w:bCs/>
-          <w:sz w:val="22"/>
-          <w:szCs w:val="22"/>
-          <w:highlight w:val="yellow"/>
-        </w:rPr>
-        <w:t>.</w:t>
-      </w:r>
-      <w:r>
-        <w:rPr>
-          <w:bCs/>
-          <w:sz w:val="22"/>
-          <w:szCs w:val="22"/>
-        </w:rPr>
-        <w:t xml:space="preserve"> </w:t>
-      </w:r>
-    </w:p>
-    <w:p>
-      <w:pPr>
-        <w:spacing w:before="240" w:after="120"/>
-        <w:jc w:val="both"/>
-        <w:rPr>
-          <w:b/>
-        </w:rPr>
-      </w:pPr>
-      <w:r>
-        <w:rPr>
-          <w:bCs/>
-          <w:sz w:val="22"/>
-          <w:szCs w:val="22"/>
-        </w:rPr>
-        <w:lastRenderedPageBreak/>
         <w:t>Ver informe original para más información.</w:t>
       </w:r>
     </w:p>
@@ -1696,6 +1572,118 @@
     </w:lvl>
   </w:abstractNum>
   <w:abstractNum w:abstractNumId="3" w15:restartNumberingAfterBreak="0">
+    <w:nsid w:val="433B6608"/>
+    <w:multiLevelType w:val="hybridMultilevel"/>
+    <w:tmpl w:val="FC1C7AE6"/>
+    <w:lvl w:ilvl="0" w:tplc="F71C7858">
+      <w:numFmt w:val="bullet"/>
+      <w:lvlText w:val="-"/>
+      <w:lvlJc w:val="left"/>
+      <w:pPr>
+        <w:ind w:left="720" w:hanging="360"/>
+      </w:pPr>
+      <w:rPr>
+        <w:rFonts w:ascii="Cambria" w:eastAsia="MS Mincho" w:hAnsi="Cambria" w:cs="Times New Roman" w:hint="default"/>
+      </w:rPr>
+    </w:lvl>
+    <w:lvl w:ilvl="1" w:tplc="2C0A0003" w:tentative="1">
+      <w:start w:val="1"/>
+      <w:numFmt w:val="bullet"/>
+      <w:lvlText w:val="o"/>
+      <w:lvlJc w:val="left"/>
+      <w:pPr>
+        <w:ind w:left="1440" w:hanging="360"/>
+      </w:pPr>
+      <w:rPr>
+        <w:rFonts w:ascii="Courier New" w:hAnsi="Courier New" w:cs="Courier New" w:hint="default"/>
+      </w:rPr>
+    </w:lvl>
+    <w:lvl w:ilvl="2" w:tplc="2C0A0005" w:tentative="1">
+      <w:start w:val="1"/>
+      <w:numFmt w:val="bullet"/>
+      <w:lvlText w:val=""/>
+      <w:lvlJc w:val="left"/>
+      <w:pPr>
+        <w:ind w:left="2160" w:hanging="360"/>
+      </w:pPr>
+      <w:rPr>
+        <w:rFonts w:ascii="Wingdings" w:hAnsi="Wingdings" w:hint="default"/>
+      </w:rPr>
+    </w:lvl>
+    <w:lvl w:ilvl="3" w:tplc="2C0A0001" w:tentative="1">
+      <w:start w:val="1"/>
+      <w:numFmt w:val="bullet"/>
+      <w:lvlText w:val=""/>
+      <w:lvlJc w:val="left"/>
+      <w:pPr>
+        <w:ind w:left="2880" w:hanging="360"/>
+      </w:pPr>
+      <w:rPr>
+        <w:rFonts w:ascii="Symbol" w:hAnsi="Symbol" w:hint="default"/>
+      </w:rPr>
+    </w:lvl>
+    <w:lvl w:ilvl="4" w:tplc="2C0A0003" w:tentative="1">
+      <w:start w:val="1"/>
+      <w:numFmt w:val="bullet"/>
+      <w:lvlText w:val="o"/>
+      <w:lvlJc w:val="left"/>
+      <w:pPr>
+        <w:ind w:left="3600" w:hanging="360"/>
+      </w:pPr>
+      <w:rPr>
+        <w:rFonts w:ascii="Courier New" w:hAnsi="Courier New" w:cs="Courier New" w:hint="default"/>
+      </w:rPr>
+    </w:lvl>
+    <w:lvl w:ilvl="5" w:tplc="2C0A0005" w:tentative="1">
+      <w:start w:val="1"/>
+      <w:numFmt w:val="bullet"/>
+      <w:lvlText w:val=""/>
+      <w:lvlJc w:val="left"/>
+      <w:pPr>
+        <w:ind w:left="4320" w:hanging="360"/>
+      </w:pPr>
+      <w:rPr>
+        <w:rFonts w:ascii="Wingdings" w:hAnsi="Wingdings" w:hint="default"/>
+      </w:rPr>
+    </w:lvl>
+    <w:lvl w:ilvl="6" w:tplc="2C0A0001" w:tentative="1">
+      <w:start w:val="1"/>
+      <w:numFmt w:val="bullet"/>
+      <w:lvlText w:val=""/>
+      <w:lvlJc w:val="left"/>
+      <w:pPr>
+        <w:ind w:left="5040" w:hanging="360"/>
+      </w:pPr>
+      <w:rPr>
+        <w:rFonts w:ascii="Symbol" w:hAnsi="Symbol" w:hint="default"/>
+      </w:rPr>
+    </w:lvl>
+    <w:lvl w:ilvl="7" w:tplc="2C0A0003" w:tentative="1">
+      <w:start w:val="1"/>
+      <w:numFmt w:val="bullet"/>
+      <w:lvlText w:val="o"/>
+      <w:lvlJc w:val="left"/>
+      <w:pPr>
+        <w:ind w:left="5760" w:hanging="360"/>
+      </w:pPr>
+      <w:rPr>
+        <w:rFonts w:ascii="Courier New" w:hAnsi="Courier New" w:cs="Courier New" w:hint="default"/>
+      </w:rPr>
+    </w:lvl>
+    <w:lvl w:ilvl="8" w:tplc="2C0A0005" w:tentative="1">
+      <w:start w:val="1"/>
+      <w:numFmt w:val="bullet"/>
+      <w:lvlText w:val=""/>
+      <w:lvlJc w:val="left"/>
+      <w:pPr>
+        <w:ind w:left="6480" w:hanging="360"/>
+      </w:pPr>
+      <w:rPr>
+        <w:rFonts w:ascii="Wingdings" w:hAnsi="Wingdings" w:hint="default"/>
+      </w:rPr>
+    </w:lvl>
+  </w:abstractNum>
+  <w:abstractNum w:abstractNumId="4" w15:restartNumberingAfterBreak="0">
     <w:nsid w:val="78EF4C68"/>
     <w:multiLevelType w:val="hybridMultilevel"/>
     <w:tmpl w:val="5CAA5534"/>
@@ -1817,6 +1805,9 @@
     <w:abstractNumId w:val="0"/>
   </w:num>
   <w:num w:numId="4" w16cid:durableId="1207646630">
+    <w:abstractNumId w:val="4"/>
+  </w:num>
+  <w:num w:numId="5" w16cid:durableId="684333295">
     <w:abstractNumId w:val="3"/>
   </w:num>
 </w:numbering>

</xml_diff>

<commit_message>
Pipeline completo: GUI, LOH, validacion de tablas y traduccion automatica
- pipeline.py: procesa una carpeta de PDFs y genera un informe por paciente,
  con un listado de errores/avisos a revisar
- gui.py: interfaz para elegir carpetas y generar los informes
- LOH: parser, templates LOH.docx y positivo_cnv_loh.docx
- validators/cnv_validator.py y check_reports.py: chequeo de las tablas de CNVs
- Traduccion de enfermedades e interpretaciones con glosarios y, para lo que
  falta, la API de Claude (auto_translator.py)
- requirements.txt
- Se dejan de versionar los datos de pacientes (input/, output/, ejemplos/),
  los __pycache__ y los archivos de bloqueo de Word

Co-Authored-By: Claude Opus 5.5 <noreply@anthropic.com>
</commit_message>
<xml_diff>
--- a/templates/positivo_cnv.docx
+++ b/templates/positivo_cnv.docx
@@ -769,9 +769,9 @@
       </w:r>
       <w:r>
         <w:rPr>
-          <w:sz w:val="22"/>
-          <w:szCs w:val="22"/>
-          <w:highlight w:val="yellow"/>
+          <w:b/>
+          <w:sz w:val="22"/>
+          <w:szCs w:val="22"/>
         </w:rPr>
         <w:t>{{ RESULTADO_VARIANTES_PATOGENICAS }}</w:t>
       </w:r>
@@ -803,6 +803,7 @@
     </w:p>
     <w:p>
       <w:pPr>
+        <w:keepNext/>
         <w:spacing w:before="240"/>
         <w:jc w:val="both"/>
         <w:rPr>
@@ -818,6 +819,7 @@
     </w:p>
     <w:p>
       <w:pPr>
+        <w:keepNext/>
         <w:spacing w:before="240" w:after="120"/>
         <w:jc w:val="both"/>
         <w:rPr>
@@ -835,6 +837,23 @@
           <w:lang w:val="es-AR"/>
         </w:rPr>
         <w:t>{{ CNV_DETECCION_PHRASE }}</w:t>
+      </w:r>
+    </w:p>
+    <w:p>
+      <w:pPr>
+        <w:spacing w:before="240" w:after="120"/>
+        <w:jc w:val="both"/>
+        <w:rPr>
+          <w:b/>
+        </w:rPr>
+      </w:pPr>
+      <w:r>
+        <w:rPr>
+          <w:bCs/>
+          <w:sz w:val="22"/>
+          <w:szCs w:val="22"/>
+        </w:rPr>
+        <w:t>{%p for v in VARIANTS_FOUND %}</w:t>
       </w:r>
     </w:p>
     <w:p>
@@ -855,16 +874,14 @@
           <w:bCs/>
           <w:sz w:val="22"/>
           <w:szCs w:val="22"/>
-          <w:u w:val="single"/>
-        </w:rPr>
-        <w:t xml:space="preserve">{% for v in VARIANTS_FOUND %}{{ v.prefix }} </w:t>
+        </w:rPr>
+        <w:t>{{ v.prefix }}</w:t>
       </w:r>
       <w:r>
         <w:rPr>
           <w:b/>
           <w:sz w:val="22"/>
           <w:szCs w:val="22"/>
-          <w:u w:val="single"/>
         </w:rPr>
         <w:t>{{ v.suffix_bold }}</w:t>
       </w:r>
@@ -873,9 +890,144 @@
           <w:bCs/>
           <w:sz w:val="22"/>
           <w:szCs w:val="22"/>
-          <w:u w:val="single"/>
-        </w:rPr>
-        <w:t xml:space="preserve"> {% endfor %}</w:t>
+        </w:rPr>
+        <w:t>{{ v.suffix_end }}</w:t>
+      </w:r>
+    </w:p>
+    <w:p>
+      <w:pPr>
+        <w:spacing w:before="240" w:after="120"/>
+        <w:jc w:val="both"/>
+        <w:rPr>
+          <w:b/>
+        </w:rPr>
+      </w:pPr>
+      <w:r>
+        <w:rPr>
+          <w:bCs/>
+          <w:sz w:val="22"/>
+          <w:szCs w:val="22"/>
+        </w:rPr>
+        <w:t>{%p endfor %}</w:t>
+      </w:r>
+    </w:p>
+    <w:p>
+      <w:pPr>
+        <w:spacing w:before="240" w:after="120"/>
+        <w:jc w:val="both"/>
+        <w:rPr>
+          <w:b/>
+        </w:rPr>
+      </w:pPr>
+      <w:r>
+        <w:rPr>
+          <w:bCs/>
+          <w:sz w:val="22"/>
+          <w:szCs w:val="22"/>
+        </w:rPr>
+        <w:t>{{ INTERPRETACION }}</w:t>
+      </w:r>
+    </w:p>
+    <w:p>
+      <w:pPr>
+        <w:spacing w:before="240" w:after="120"/>
+        <w:jc w:val="both"/>
+        <w:rPr>
+          <w:b/>
+        </w:rPr>
+      </w:pPr>
+      <w:r>
+        <w:rPr>
+          <w:bCs/>
+          <w:sz w:val="22"/>
+          <w:szCs w:val="22"/>
+        </w:rPr>
+        <w:t>{%p if REFERENCIAS %}</w:t>
+      </w:r>
+    </w:p>
+    <w:p>
+      <w:pPr>
+        <w:spacing w:before="240" w:after="120"/>
+        <w:jc w:val="both"/>
+        <w:rPr>
+          <w:b/>
+        </w:rPr>
+      </w:pPr>
+      <w:r>
+        <w:rPr>
+          <w:bCs/>
+          <w:sz w:val="22"/>
+          <w:szCs w:val="22"/>
+        </w:rPr>
+        <w:t>Referencias</w:t>
+      </w:r>
+    </w:p>
+    <w:p>
+      <w:pPr>
+        <w:spacing w:before="240" w:after="120"/>
+        <w:jc w:val="both"/>
+        <w:rPr>
+          <w:b/>
+        </w:rPr>
+      </w:pPr>
+      <w:r>
+        <w:rPr>
+          <w:bCs/>
+          <w:sz w:val="22"/>
+          <w:szCs w:val="22"/>
+        </w:rPr>
+        <w:t>{%p for r in REFERENCIAS %}</w:t>
+      </w:r>
+    </w:p>
+    <w:p>
+      <w:pPr>
+        <w:spacing w:before="240" w:after="120"/>
+        <w:jc w:val="both"/>
+        <w:rPr>
+          <w:b/>
+        </w:rPr>
+      </w:pPr>
+      <w:r>
+        <w:rPr>
+          <w:bCs/>
+          <w:sz w:val="22"/>
+          <w:szCs w:val="22"/>
+        </w:rPr>
+        <w:t>{{ r }}</w:t>
+      </w:r>
+    </w:p>
+    <w:p>
+      <w:pPr>
+        <w:spacing w:before="240" w:after="120"/>
+        <w:jc w:val="both"/>
+        <w:rPr>
+          <w:b/>
+        </w:rPr>
+      </w:pPr>
+      <w:r>
+        <w:rPr>
+          <w:bCs/>
+          <w:sz w:val="22"/>
+          <w:szCs w:val="22"/>
+        </w:rPr>
+        <w:t>{%p endfor %}</w:t>
+      </w:r>
+    </w:p>
+    <w:p>
+      <w:pPr>
+        <w:spacing w:before="240" w:after="120"/>
+        <w:jc w:val="both"/>
+        <w:rPr>
+          <w:b/>
+        </w:rPr>
+      </w:pPr>
+      <w:r>
+        <w:rPr>
+          <w:bCs/>
+          <w:sz w:val="22"/>
+          <w:szCs w:val="22"/>
+        </w:rPr>
+        <w:t>{%p endif %}</w:t>
       </w:r>
     </w:p>
     <w:p>

</xml_diff>